<commit_message>
:books: docs: Correção no documento word: Esqueci do Giovanni
</commit_message>
<xml_diff>
--- a/documentation/Sprint14_Task064_Validações_dos_campos_da_despesa.docx
+++ b/documentation/Sprint14_Task064_Validações_dos_campos_da_despesa.docx
@@ -357,7 +357,13 @@
           </w:tcPr>
           <w:p>
             <w:r>
-              <w:t>Carlos Alberto Ferreira Candido</w:t>
+              <w:t>Carlos Alberto Ferreira C</w:t>
+            </w:r>
+            <w:r>
+              <w:t>a</w:t>
+            </w:r>
+            <w:r>
+              <w:t>ndido</w:t>
             </w:r>
           </w:p>
         </w:tc>
@@ -394,7 +400,11 @@
             <w:tcW w:w="10201" w:type="dxa"/>
             <w:gridSpan w:val="4"/>
           </w:tcPr>
-          <w:p/>
+          <w:p>
+            <w:r>
+              <w:t>Giovanni da Silva Nascimento</w:t>
+            </w:r>
+          </w:p>
         </w:tc>
       </w:tr>
       <w:tr>
@@ -748,7 +758,7 @@
           </w:tcPr>
           <w:p>
             <w:r>
-              <w:t>Garantir que o cadastro de secretarias possua validações completas de integridade, padronização e consistência dos dados, evitando informações inválidas ou duplicadas no sistema.</w:t>
+              <w:t>Garantir que o cadastro de despesas possua validações completas de integridade, consistência e regras de negócio, evitando pagamentos duplicados, dados inválidos e inconsistências financeiras no sistema.</w:t>
             </w:r>
           </w:p>
         </w:tc>
@@ -758,7 +768,13 @@
           </w:tcPr>
           <w:p>
             <w:r>
-              <w:t>Carlos Alberto Ferreira Candido,</w:t>
+              <w:t>Carlos Alberto Ferreira C</w:t>
+            </w:r>
+            <w:r>
+              <w:t>a</w:t>
+            </w:r>
+            <w:r>
+              <w:t>ndido,</w:t>
             </w:r>
             <w:r>
               <w:br/>
@@ -779,6 +795,12 @@
               <w:t>Cestonaro</w:t>
             </w:r>
             <w:proofErr w:type="spellEnd"/>
+            <w:r>
+              <w:t xml:space="preserve">, </w:t>
+            </w:r>
+            <w:r>
+              <w:t>Giovanni da Silva Nascimento</w:t>
+            </w:r>
           </w:p>
         </w:tc>
         <w:tc>
@@ -995,7 +1017,7 @@
           <w:bCs/>
         </w:rPr>
         <w:pict w14:anchorId="5218EAE2">
-          <v:rect id="_x0000_i1051" style="width:0;height:3pt" o:hralign="center" o:hrstd="t" o:hr="t" fillcolor="#a0a0a0" stroked="f"/>
+          <v:rect id="_x0000_i1025" style="width:0;height:3pt" o:hralign="center" o:hrstd="t" o:hr="t" fillcolor="#a0a0a0" stroked="f"/>
         </w:pict>
       </w:r>
     </w:p>
@@ -1090,6 +1112,7 @@
           <w:b/>
           <w:bCs/>
         </w:rPr>
+        <w:lastRenderedPageBreak/>
         <w:t>Formatação correta</w:t>
       </w:r>
     </w:p>
@@ -1111,7 +1134,6 @@
           <w:b/>
           <w:bCs/>
         </w:rPr>
-        <w:lastRenderedPageBreak/>
         <w:t>Consistência de valores</w:t>
       </w:r>
     </w:p>
@@ -1172,7 +1194,7 @@
           <w:bCs/>
         </w:rPr>
         <w:pict w14:anchorId="20F7B49F">
-          <v:rect id="_x0000_i1052" style="width:0;height:3pt" o:hralign="center" o:hrstd="t" o:hr="t" fillcolor="#a0a0a0" stroked="f"/>
+          <v:rect id="_x0000_i1026" style="width:0;height:3pt" o:hralign="center" o:hrstd="t" o:hr="t" fillcolor="#a0a0a0" stroked="f"/>
         </w:pict>
       </w:r>
     </w:p>
@@ -1466,7 +1488,7 @@
           <w:bCs/>
         </w:rPr>
         <w:pict w14:anchorId="59D90D67">
-          <v:rect id="_x0000_i1053" style="width:0;height:3pt" o:hralign="center" o:hrstd="t" o:hr="t" fillcolor="#a0a0a0" stroked="f"/>
+          <v:rect id="_x0000_i1027" style="width:0;height:3pt" o:hralign="center" o:hrstd="t" o:hr="t" fillcolor="#a0a0a0" stroked="f"/>
         </w:pict>
       </w:r>
     </w:p>
@@ -1592,7 +1614,7 @@
           <w:bCs/>
         </w:rPr>
         <w:pict w14:anchorId="76E419DB">
-          <v:rect id="_x0000_i1054" style="width:0;height:3pt" o:hralign="center" o:hrstd="t" o:hr="t" fillcolor="#a0a0a0" stroked="f"/>
+          <v:rect id="_x0000_i1028" style="width:0;height:3pt" o:hralign="center" o:hrstd="t" o:hr="t" fillcolor="#a0a0a0" stroked="f"/>
         </w:pict>
       </w:r>
     </w:p>
@@ -1763,7 +1785,7 @@
           <w:bCs/>
         </w:rPr>
         <w:pict w14:anchorId="27C0E6EA">
-          <v:rect id="_x0000_i1055" style="width:0;height:3pt" o:hralign="center" o:hrstd="t" o:hr="t" fillcolor="#a0a0a0" stroked="f"/>
+          <v:rect id="_x0000_i1029" style="width:0;height:3pt" o:hralign="center" o:hrstd="t" o:hr="t" fillcolor="#a0a0a0" stroked="f"/>
         </w:pict>
       </w:r>
     </w:p>
@@ -1781,6 +1803,7 @@
           <w:b/>
           <w:bCs/>
         </w:rPr>
+        <w:lastRenderedPageBreak/>
         <w:t>🔹 Validação de Data de Emissão</w:t>
       </w:r>
     </w:p>
@@ -1802,7 +1825,6 @@
           <w:b/>
           <w:bCs/>
         </w:rPr>
-        <w:lastRenderedPageBreak/>
         <w:t>Deve ser uma data válida</w:t>
       </w:r>
     </w:p>
@@ -1873,7 +1895,7 @@
           <w:bCs/>
         </w:rPr>
         <w:pict w14:anchorId="2E675854">
-          <v:rect id="_x0000_i1056" style="width:0;height:3pt" o:hralign="center" o:hrstd="t" o:hr="t" fillcolor="#a0a0a0" stroked="f"/>
+          <v:rect id="_x0000_i1030" style="width:0;height:3pt" o:hralign="center" o:hrstd="t" o:hr="t" fillcolor="#a0a0a0" stroked="f"/>
         </w:pict>
       </w:r>
     </w:p>
@@ -1947,7 +1969,7 @@
           <w:bCs/>
         </w:rPr>
         <w:pict w14:anchorId="4DB466A1">
-          <v:rect id="_x0000_i1057" style="width:0;height:3pt" o:hralign="center" o:hrstd="t" o:hr="t" fillcolor="#a0a0a0" stroked="f"/>
+          <v:rect id="_x0000_i1031" style="width:0;height:3pt" o:hralign="center" o:hrstd="t" o:hr="t" fillcolor="#a0a0a0" stroked="f"/>
         </w:pict>
       </w:r>
     </w:p>
@@ -2038,7 +2060,7 @@
           <w:bCs/>
         </w:rPr>
         <w:pict w14:anchorId="1CD21FB5">
-          <v:rect id="_x0000_i1058" style="width:0;height:3pt" o:hralign="center" o:hrstd="t" o:hr="t" fillcolor="#a0a0a0" stroked="f"/>
+          <v:rect id="_x0000_i1032" style="width:0;height:3pt" o:hralign="center" o:hrstd="t" o:hr="t" fillcolor="#a0a0a0" stroked="f"/>
         </w:pict>
       </w:r>
     </w:p>
@@ -2167,7 +2189,7 @@
           <w:bCs/>
         </w:rPr>
         <w:pict w14:anchorId="441727D6">
-          <v:rect id="_x0000_i1059" style="width:0;height:3pt" o:hralign="center" o:hrstd="t" o:hr="t" fillcolor="#a0a0a0" stroked="f"/>
+          <v:rect id="_x0000_i1033" style="width:0;height:3pt" o:hralign="center" o:hrstd="t" o:hr="t" fillcolor="#a0a0a0" stroked="f"/>
         </w:pict>
       </w:r>
     </w:p>
@@ -2464,6 +2486,7 @@
           <w:b/>
           <w:bCs/>
         </w:rPr>
+        <w:lastRenderedPageBreak/>
         <w:t>Instituição deve existir</w:t>
       </w:r>
     </w:p>
@@ -2485,7 +2508,6 @@
           <w:b/>
           <w:bCs/>
         </w:rPr>
-        <w:lastRenderedPageBreak/>
         <w:t>Fornecedor deve existir</w:t>
       </w:r>
     </w:p>
@@ -2525,7 +2547,7 @@
           <w:bCs/>
         </w:rPr>
         <w:pict w14:anchorId="476028B7">
-          <v:rect id="_x0000_i1060" style="width:0;height:3pt" o:hralign="center" o:hrstd="t" o:hr="t" fillcolor="#a0a0a0" stroked="f"/>
+          <v:rect id="_x0000_i1034" style="width:0;height:3pt" o:hralign="center" o:hrstd="t" o:hr="t" fillcolor="#a0a0a0" stroked="f"/>
         </w:pict>
       </w:r>
     </w:p>
@@ -2679,7 +2701,7 @@
           <w:bCs/>
         </w:rPr>
         <w:pict w14:anchorId="4F06C481">
-          <v:rect id="_x0000_i1061" style="width:0;height:3pt" o:hralign="center" o:hrstd="t" o:hr="t" fillcolor="#a0a0a0" stroked="f"/>
+          <v:rect id="_x0000_i1035" style="width:0;height:3pt" o:hralign="center" o:hrstd="t" o:hr="t" fillcolor="#a0a0a0" stroked="f"/>
         </w:pict>
       </w:r>
     </w:p>
@@ -2788,7 +2810,7 @@
           <w:bCs/>
         </w:rPr>
         <w:pict w14:anchorId="51AD6267">
-          <v:rect id="_x0000_i1062" style="width:0;height:3pt" o:hralign="center" o:hrstd="t" o:hr="t" fillcolor="#a0a0a0" stroked="f"/>
+          <v:rect id="_x0000_i1036" style="width:0;height:3pt" o:hralign="center" o:hrstd="t" o:hr="t" fillcolor="#a0a0a0" stroked="f"/>
         </w:pict>
       </w:r>
     </w:p>
@@ -2845,7 +2867,7 @@
           <w:bCs/>
         </w:rPr>
         <w:pict w14:anchorId="03A4E595">
-          <v:rect id="_x0000_i1063" style="width:0;height:3pt" o:hralign="center" o:hrstd="t" o:hr="t" fillcolor="#a0a0a0" stroked="f"/>
+          <v:rect id="_x0000_i1037" style="width:0;height:3pt" o:hralign="center" o:hrstd="t" o:hr="t" fillcolor="#a0a0a0" stroked="f"/>
         </w:pict>
       </w:r>
     </w:p>
@@ -2902,7 +2924,7 @@
           <w:bCs/>
         </w:rPr>
         <w:pict w14:anchorId="680848A3">
-          <v:rect id="_x0000_i1064" style="width:0;height:3pt" o:hralign="center" o:hrstd="t" o:hr="t" fillcolor="#a0a0a0" stroked="f"/>
+          <v:rect id="_x0000_i1038" style="width:0;height:3pt" o:hralign="center" o:hrstd="t" o:hr="t" fillcolor="#a0a0a0" stroked="f"/>
         </w:pict>
       </w:r>
     </w:p>
@@ -3071,7 +3093,7 @@
           <w:bCs/>
         </w:rPr>
         <w:pict w14:anchorId="20D7884F">
-          <v:rect id="_x0000_i1065" style="width:0;height:3pt" o:hralign="center" o:hrstd="t" o:hr="t" fillcolor="#a0a0a0" stroked="f"/>
+          <v:rect id="_x0000_i1039" style="width:0;height:3pt" o:hralign="center" o:hrstd="t" o:hr="t" fillcolor="#a0a0a0" stroked="f"/>
         </w:pict>
       </w:r>
     </w:p>
@@ -3218,22 +3240,7 @@
     <w:p/>
     <w:p>
       <w:r>
-        <w:t>Primeiramente fo</w:t>
-      </w:r>
-      <w:r>
-        <w:t>ram feitos</w:t>
-      </w:r>
-      <w:r>
-        <w:t xml:space="preserve"> método</w:t>
-      </w:r>
-      <w:r>
-        <w:t>s</w:t>
-      </w:r>
-      <w:r>
-        <w:t xml:space="preserve"> </w:t>
-      </w:r>
-      <w:r>
-        <w:t xml:space="preserve">no </w:t>
+        <w:t xml:space="preserve">Primeiramente foram feitos métodos no </w:t>
       </w:r>
       <w:proofErr w:type="spellStart"/>
       <w:r>
@@ -3246,6 +3253,9 @@
     </w:p>
     <w:p>
       <w:r>
+        <w:rPr>
+          <w:noProof/>
+        </w:rPr>
         <w:drawing>
           <wp:inline distT="0" distB="0" distL="0" distR="0" wp14:anchorId="4C674A86" wp14:editId="0172C9DB">
             <wp:extent cx="6472555" cy="3023235"/>
@@ -3310,6 +3320,7 @@
       <w:r>
         <w:rPr>
           <w:rFonts w:ascii="Times New Roman" w:eastAsia="Times New Roman" w:hAnsi="Times New Roman" w:cs="Times New Roman"/>
+          <w:noProof/>
           <w:kern w:val="0"/>
           <w:sz w:val="24"/>
           <w:szCs w:val="24"/>
@@ -3380,6 +3391,7 @@
       <w:r>
         <w:rPr>
           <w:rFonts w:ascii="Times New Roman" w:eastAsia="Times New Roman" w:hAnsi="Times New Roman" w:cs="Times New Roman"/>
+          <w:noProof/>
           <w:kern w:val="0"/>
           <w:sz w:val="24"/>
           <w:szCs w:val="24"/>
@@ -3451,6 +3463,7 @@
       <w:r>
         <w:rPr>
           <w:rFonts w:ascii="Times New Roman" w:eastAsia="Times New Roman" w:hAnsi="Times New Roman" w:cs="Times New Roman"/>
+          <w:noProof/>
           <w:kern w:val="0"/>
           <w:sz w:val="24"/>
           <w:szCs w:val="24"/>
@@ -3530,6 +3543,9 @@
     </w:p>
     <w:p>
       <w:r>
+        <w:rPr>
+          <w:noProof/>
+        </w:rPr>
         <w:drawing>
           <wp:inline distT="0" distB="0" distL="0" distR="0" wp14:anchorId="44260A8A" wp14:editId="27B1B1CD">
             <wp:extent cx="6472555" cy="2327910"/>
@@ -3582,6 +3598,9 @@
     </w:p>
     <w:p>
       <w:r>
+        <w:rPr>
+          <w:noProof/>
+        </w:rPr>
         <w:lastRenderedPageBreak/>
         <w:drawing>
           <wp:inline distT="0" distB="0" distL="0" distR="0" wp14:anchorId="7F023D75" wp14:editId="253B8E24">
@@ -3635,6 +3654,9 @@
     </w:p>
     <w:p>
       <w:r>
+        <w:rPr>
+          <w:noProof/>
+        </w:rPr>
         <w:drawing>
           <wp:inline distT="0" distB="0" distL="0" distR="0" wp14:anchorId="550119C2" wp14:editId="795B5776">
             <wp:extent cx="6472555" cy="2630805"/>
@@ -3696,6 +3718,9 @@
         <w:t xml:space="preserve"> </w:t>
       </w:r>
       <w:r>
+        <w:rPr>
+          <w:noProof/>
+        </w:rPr>
         <w:drawing>
           <wp:inline distT="0" distB="0" distL="0" distR="0" wp14:anchorId="1F18FD36" wp14:editId="5B7EC593">
             <wp:extent cx="6472555" cy="3500755"/>
@@ -3748,6 +3773,9 @@
     </w:p>
     <w:p>
       <w:r>
+        <w:rPr>
+          <w:noProof/>
+        </w:rPr>
         <w:lastRenderedPageBreak/>
         <w:drawing>
           <wp:inline distT="0" distB="0" distL="0" distR="0" wp14:anchorId="4E867CA1" wp14:editId="39B23116">
@@ -3802,6 +3830,9 @@
     <w:p/>
     <w:p>
       <w:r>
+        <w:rPr>
+          <w:noProof/>
+        </w:rPr>
         <w:drawing>
           <wp:inline distT="0" distB="0" distL="0" distR="0" wp14:anchorId="5FE4E98F" wp14:editId="577BA575">
             <wp:extent cx="6472555" cy="2962275"/>
@@ -3859,6 +3890,9 @@
     </w:p>
     <w:p>
       <w:r>
+        <w:rPr>
+          <w:noProof/>
+        </w:rPr>
         <w:drawing>
           <wp:inline distT="0" distB="0" distL="0" distR="0" wp14:anchorId="089CF7F2" wp14:editId="5EC96BA3">
             <wp:extent cx="6334125" cy="400050"/>
@@ -3912,6 +3946,9 @@
     <w:p/>
     <w:p>
       <w:r>
+        <w:rPr>
+          <w:noProof/>
+        </w:rPr>
         <w:drawing>
           <wp:inline distT="0" distB="0" distL="0" distR="0" wp14:anchorId="42A021BF" wp14:editId="6F00DE4C">
             <wp:extent cx="6472555" cy="1049020"/>
@@ -3969,6 +4006,9 @@
     </w:p>
     <w:p>
       <w:r>
+        <w:rPr>
+          <w:noProof/>
+        </w:rPr>
         <w:lastRenderedPageBreak/>
         <w:drawing>
           <wp:inline distT="0" distB="0" distL="0" distR="0" wp14:anchorId="44214A37" wp14:editId="770A470F">
@@ -4022,6 +4062,9 @@
     </w:p>
     <w:p>
       <w:r>
+        <w:rPr>
+          <w:noProof/>
+        </w:rPr>
         <w:drawing>
           <wp:inline distT="0" distB="0" distL="0" distR="0" wp14:anchorId="3CE57A04" wp14:editId="359C0B38">
             <wp:extent cx="6472555" cy="3178810"/>
@@ -4080,6 +4123,9 @@
         <w:br/>
       </w:r>
       <w:r>
+        <w:rPr>
+          <w:noProof/>
+        </w:rPr>
         <w:drawing>
           <wp:inline distT="0" distB="0" distL="0" distR="0" wp14:anchorId="133894A0" wp14:editId="6525A886">
             <wp:extent cx="5019675" cy="504825"/>
@@ -4132,6 +4178,9 @@
     </w:p>
     <w:p>
       <w:r>
+        <w:rPr>
+          <w:noProof/>
+        </w:rPr>
         <w:drawing>
           <wp:inline distT="0" distB="0" distL="0" distR="0" wp14:anchorId="2ABB4747" wp14:editId="4723DE3A">
             <wp:extent cx="4724400" cy="1228725"/>

</xml_diff>